<commit_message>
feat(itrust-study): publish specification and test suite v6.0
</commit_message>
<xml_diff>
--- a/output/docx/UC7OfficeVisit.docx
+++ b/output/docx/UC7OfficeVisit.docx
@@ -39,7 +39,7 @@
           <w:sz w:val="30"/>
           <w:color w:val="1A365D"/>
         </w:rPr>
-        <w:t>Use Case: UC7 Office Visit (v4.0)</w:t>
+        <w:t>Use Case: UC7 Office Visit (v6.0)</w:t>
       </w:r>
     </w:p>
     <w:p>
@@ -513,7 +513,7 @@
               <w:rPr>
                 <w:sz w:val="18"/>
               </w:rPr>
-              <w:t>hcp: The HCP provides additional details about the office visit as appropriate for the appointment type: General Checkup Basic Health Metrics (uc8)</w:t>
+              <w:t>hcp: The HCP provides additional details about the office visit as appropriate for the appointment type: General Checkup Basic Health Metrics (uc8) [Ophthalmology Office Visit](uc21) [Ophthalmology Surgeries](uc22)</w:t>
             </w:r>
           </w:p>
         </w:tc>

</xml_diff>